<commit_message>
Update academic reports (DOCX/ODT/PDF) and add video demo script to match the upgraded PBFT TCP/RocksDB/Ed25519 system
</commit_message>
<xml_diff>
--- a/BaoCao_BFT_Distributed_Ledger.docx
+++ b/BaoCao_BFT_Distributed_Ledger.docx
@@ -240,28 +240,17 @@
         <w:ind w:left="720" w:hanging="360"/>
       </w:pPr>
       <w:r>
-        <w:rPr>
-          <w:rFonts w:ascii="Times New Roman" w:hAnsi="Times New Roman"/>
-          <w:b/>
-          <w:bCs w:val="1"/>
-          <w:rtl w:val="0"/>
-        </w:rPr>
-        <w:t>Core Logic:</w:t>
-      </w:r>
-      <w:r>
-        <w:rPr>
-          <w:rFonts w:ascii="Times New Roman" w:hAnsi="Times New Roman"/>
-          <w:rtl w:val="0"/>
-        </w:rPr>
-        <w:t xml:space="preserve"> Giao thức đồng thuận BFT rút gọn được xây dựng trên mô hình N = 3f + 1 node (chịu tối đa f node Byzantine lỗi). Trong mô phỏng này, f = 1 nên tổng số site N = 4, và Quorum đồng thuận là 2f + 1 = 3 phiếu COMMIT. Giao thức bao gồm:</w:t>
-        <w:br/>
-        <w:t xml:space="preserve">  1. Giai đoạn Propose: Node Leader đề xuất giao dịch mới.</w:t>
-        <w:br/>
-        <w:t xml:space="preserve">  2. Giai đoạn Vote &amp; Verify: Các site xác thực chữ ký số giả lập của message, kiểm tra tính đúng đắn của giao dịch và phát phiếu bầu (COMMIT/ABORT). Nút Byzantine (Site 0) thực hiện equivocation (phát phiếu mâu thuẫn).</w:t>
-        <w:br/>
-        <w:t xml:space="preserve">  3. Giai đoạn Commit/Abort: Các site thu thập phiếu bầu, nếu đủ Quorum 2f+1 phiếu trùng khớp thì tiến hành ghi vào Ledger và lưu trạng thái vào Write-Ahead Log (WAL) dưới định dạng JSON Lines.</w:t>
-        <w:br/>
-        <w:t xml:space="preserve">  4. Giao thức Crash Recovery: Site 1 bị crash trong Phase 1, sau khi phục hồi sẽ tự động đọc WAL để khôi phục trạng thái READY và gửi thông điệp yêu cầu phiếu bầu từ các site khác để hoàn tất giao dịch.</w:t>
+        <w:t>Core Logic: Giao thức đồng thuận PBFT (Practical Byzantine Fault Tolerance) thực tế được xây dựng trên mô hình N = 3f + 1 node (chịu tối đa f node Byzantine lỗi). Trong mạng lưới này, f = 1 nên tổng số site N = 4, và Quorum đồng thuận là 2f + 1 = 3 phiếu đồng thuận ở mỗi pha. Giao thức bao gồm:</w:t>
+        <w:br/>
+        <w:t xml:space="preserve">  1. Thiết lập mạng TCP phân tán: Các node kết nối và duy trì liên lạc qua Connection Pool và cơ chế Heartbeat PING/PONG.</w:t>
+        <w:br/>
+        <w:t xml:space="preserve">  2. Xác thực Ed25519: Client độc lập ký giao dịch bằng khóa bí mật, các node xác thực chữ ký số Ed25519 thực tế trước khi đưa vào hàng đợi đồng thuận.</w:t>
+        <w:br/>
+        <w:t xml:space="preserve">  3. Đồng thuận 3 pha PBFT: Trải qua các giai đoạn Pre-prepare (Leader đề xuất digest), Prepare (phát chéo phiếu bầu digest), và Commit (đạt quorum 2f+1 cam kết ghi sổ).</w:t>
+        <w:br/>
+        <w:t xml:space="preserve">  4. Checkpoint &amp; Cắt tỉa WAL: Mỗi K giao dịch, hệ thống chụp stable checkpoint để tối ưu hóa bộ nhớ và xóa logs cũ trong RocksDB.</w:t>
+        <w:br/>
+        <w:t xml:space="preserve">  5. Crash Recovery: Khi node bị crash và khởi động lại, nó đọc stable checkpoint từ RocksDB và replay WAL để khôi phục trạng thái World State số dư.</w:t>
       </w:r>
     </w:p>
     <w:p>
@@ -501,20 +490,7 @@
         <w:ind w:left="720" w:hanging="360"/>
       </w:pPr>
       <w:r>
-        <w:rPr>
-          <w:rFonts w:ascii="Times New Roman" w:hAnsi="Times New Roman"/>
-          <w:b/>
-          <w:bCs w:val="1"/>
-          <w:rtl w:val="0"/>
-        </w:rPr>
-        <w:t>Communication Layer:</w:t>
-      </w:r>
-      <w:r>
-        <w:rPr>
-          <w:rFonts w:ascii="Times New Roman" w:hAnsi="Times New Roman"/>
-          <w:rtl w:val="0"/>
-        </w:rPr>
-        <w:t xml:space="preserve"> Kênh truyền mạng bất đồng bộ mô phỏng bằng multiprocessing.Queue với độ trễ ngẫu nhiên từ 50ms đến 200ms.</w:t>
+        <w:t>Communication Layer: Kênh truyền mạng TCP Sockets phân tán thực tế chạy trên các cổng độc lập (localhost:5000-5003 hoặc container Docker), kết hợp với Connection Pool duy trì kết nối dài hạn và cơ chế Heartbeat PING/PONG.</w:t>
       </w:r>
     </w:p>
     <w:p>
@@ -527,20 +503,7 @@
         <w:ind w:left="720" w:hanging="360"/>
       </w:pPr>
       <w:r>
-        <w:rPr>
-          <w:rFonts w:ascii="Times New Roman" w:hAnsi="Times New Roman"/>
-          <w:b/>
-          <w:bCs w:val="1"/>
-          <w:rtl w:val="0"/>
-        </w:rPr>
-        <w:t>Storage:</w:t>
-      </w:r>
-      <w:r>
-        <w:rPr>
-          <w:rFonts w:ascii="Times New Roman" w:hAnsi="Times New Roman"/>
-          <w:rtl w:val="0"/>
-        </w:rPr>
-        <w:t xml:space="preserve"> Trạng thái đồng thuận được ghi đĩa vật lý dưới dạng Write-Ahead Log (WAL) bằng file JSON Lines (tại wal/site_x.wal). Sổ cái Ledger được lưu trữ trên bộ nhớ RAM tiến trình và đồng bộ từ WAL khi khởi động lại.</w:t>
+        <w:t>Storage: Cơ sở dữ liệu RocksDB (LSM-Tree) hiệu năng cao cho từng node, quản lý dữ liệu thông qua các prefix prefix như: wal:: (Write-Ahead Log), state:: (World State số dư), ledger:: (sổ cái giao dịch), và checkpoint:: (trạng thái checkpoint stable).</w:t>
       </w:r>
     </w:p>
     <w:p>
@@ -607,20 +570,7 @@
         <w:ind w:left="720" w:hanging="360"/>
       </w:pPr>
       <w:r>
-        <w:rPr>
-          <w:rFonts w:ascii="Times New Roman" w:hAnsi="Times New Roman"/>
-          <w:b/>
-          <w:bCs w:val="1"/>
-          <w:rtl w:val="0"/>
-        </w:rPr>
-        <w:t>Deployment:</w:t>
-      </w:r>
-      <w:r>
-        <w:rPr>
-          <w:rFonts w:ascii="Times New Roman" w:hAnsi="Times New Roman"/>
-          <w:rtl w:val="0"/>
-        </w:rPr>
-        <w:t xml:space="preserve"> Đa tiến trình (multiprocessing) chạy cục bộ trên Localhost.</w:t>
+        <w:t>Deployment: Chạy phân tán trên môi trường mạng TCP Sockets cục bộ hoặc container hóa hoàn chỉnh bằng Docker Compose.</w:t>
       </w:r>
     </w:p>
     <w:p>
@@ -633,20 +583,7 @@
         <w:ind w:left="720" w:hanging="360"/>
       </w:pPr>
       <w:r>
-        <w:rPr>
-          <w:rFonts w:ascii="Times New Roman" w:hAnsi="Times New Roman"/>
-          <w:b/>
-          <w:bCs w:val="1"/>
-          <w:rtl w:val="0"/>
-        </w:rPr>
-        <w:t>Libraries/Frameworks:</w:t>
-      </w:r>
-      <w:r>
-        <w:rPr>
-          <w:rFonts w:ascii="Times New Roman" w:hAnsi="Times New Roman"/>
-          <w:rtl w:val="0"/>
-        </w:rPr>
-        <w:t xml:space="preserve"> multiprocessing, queue, json, hashlib, logging, time.</w:t>
+        <w:t>Libraries/Frameworks: rocksdict (RocksDB), cryptography (Ed25519), socket, threading, json, logging, time.</w:t>
       </w:r>
     </w:p>
     <w:p>
@@ -871,11 +808,7 @@
         <w:spacing w:line="276" w:lineRule="auto" w:after="120"/>
       </w:pPr>
       <w:r>
-        <w:rPr>
-          <w:rFonts w:ascii="Times New Roman" w:hAnsi="Times New Roman"/>
-          <w:sz w:val="22"/>
-        </w:rPr>
-        <w:t>Hệ thống mô phỏng BFT được cài đặt hoàn chỉnh trong tệp main.py bằng ngôn ngữ Python. Kiến trúc mã nguồn được phân tách rõ ràng thành các hàm chức năng độc lập nhằm đảm bảo nguyên tắc Single Responsibility (Đơn nhiệm), giúp mã nguồn dễ đọc, dễ kiểm thử và bảo trì:</w:t>
+        <w:t>Hệ thống PBFT thực tế được cài đặt phân tán hoàn chỉnh theo kiến trúc mô-đun hóa trong Python. Các thành phần logic chính được chia tách rõ ràng thành các tệp tin chuyên biệt: network/connection_pool.py (quản lý socket TCP), consensus/pbft.py (máy trạng thái 3 pha), storage/rocksdb_store.py (lưu trữ RocksDB), client.py (client ký Ed25519 và gửi giao dịch) và node.py (tiến trình node chính).</w:t>
       </w:r>
     </w:p>
     <w:tbl>
@@ -1317,73 +1250,71 @@
         <w:shd w:fill="F5F5F5" w:val="clear"/>
       </w:pPr>
       <w:r>
-        <w:rPr>
-          <w:rFonts w:ascii="Consolas" w:hAnsi="Consolas"/>
-          <w:color w:val="202020"/>
-          <w:sz w:val="18"/>
-        </w:rPr>
-        <w:t>def byzantine_broadcast(qs, sid, tx_id, log):</w:t>
-        <w:br/>
-        <w:t xml:space="preserve">    """Leader Byzantine (Site 0) thuc hien Equivocation"""</w:t>
-        <w:br/>
-        <w:t xml:space="preserve">    log.info('LEADER_BYZANTINE', f'tx_id={tx_id} | !!! BAT DAU EQUIVOCATION !!!')</w:t>
-        <w:br/>
-        <w:t xml:space="preserve">    for t in range(NUM_SITES):</w:t>
-        <w:br/>
-        <w:t xml:space="preserve">        # COMMIT cho site chan (0, 2), ABORT cho site le (1, 3)</w:t>
-        <w:br/>
-        <w:t xml:space="preserve">        fake_vote = VOTE_COMMIT if t % 2 == 0 else VOTE_ABORT</w:t>
-        <w:br/>
-        <w:t xml:space="preserve">        msg = {</w:t>
-        <w:br/>
-        <w:t xml:space="preserve">            'type': MSG_VOTE,</w:t>
-        <w:br/>
-        <w:t xml:space="preserve">            'sender': sid,</w:t>
-        <w:br/>
-        <w:t xml:space="preserve">            'tx_id': tx_id,</w:t>
-        <w:br/>
-        <w:t xml:space="preserve">            'vote': fake_vote</w:t>
-        <w:br/>
-        <w:t xml:space="preserve">        }</w:t>
-        <w:br/>
-        <w:t xml:space="preserve">        sign_message(msg, sid)  # Gia lap ky so de xac thuc nguon gui</w:t>
-        <w:br/>
-        <w:t xml:space="preserve">        qs[t].put(msg)</w:t>
-        <w:br/>
-        <w:t xml:space="preserve">        log.info('SEND', f'tx_id={tx_id} | {fake_vote} | to=Site {t} [EQUIVOCATION]')</w:t>
-        <w:br/>
-        <w:br/>
-        <w:t>def collect_votes(q, sid, tx_id, log, timeout=TIMEOUT):</w:t>
-        <w:br/>
-        <w:t xml:space="preserve">    """Thu thap va xac thuc phieu bau tu hang doi tin nhan"""</w:t>
-        <w:br/>
-        <w:t xml:space="preserve">    votes = {}</w:t>
-        <w:br/>
-        <w:t xml:space="preserve">    start_time = time.time()</w:t>
-        <w:br/>
-        <w:t xml:space="preserve">    while len(votes) &lt; NUM_SITES and (time.time() - start_time) &lt; timeout:</w:t>
-        <w:br/>
-        <w:t xml:space="preserve">        try:</w:t>
-        <w:br/>
-        <w:t xml:space="preserve">            msg = q.get(timeout=0.1)</w:t>
-        <w:br/>
-        <w:t xml:space="preserve">            if msg.get('tx_id') != tx_id or msg.get('type') != MSG_VOTE:</w:t>
-        <w:br/>
-        <w:t xml:space="preserve">                continue</w:t>
-        <w:br/>
-        <w:t xml:space="preserve">            if not verify_signature(msg):  # Ngan chan Byzantine gia mao danh tinh</w:t>
-        <w:br/>
-        <w:t xml:space="preserve">                log.info('SECURITY', f'tx_id={tx_id} | Chuky gia mao tu Site {msg.get("sender")}!')</w:t>
-        <w:br/>
-        <w:t xml:space="preserve">                continue</w:t>
-        <w:br/>
-        <w:t xml:space="preserve">            votes[msg['sender']] = msg['vote']</w:t>
-        <w:br/>
-        <w:t xml:space="preserve">        except queue.Empty:</w:t>
-        <w:br/>
-        <w:t xml:space="preserve">            continue</w:t>
-        <w:br/>
-        <w:t xml:space="preserve">    return votes</w:t>
+        <w:t>Đoạn mã xử lý máy trạng thái đồng thuận PBFT 3 pha (Pre-prepare, Prepare, Commit) và xác thực chữ ký Ed25519 thực tế:</w:t>
+        <w:br/>
+        <w:br/>
+        <w:t># Trích đoạn xử lý đồng thuận 3 pha trong consensus/pbft.py:</w:t>
+        <w:br/>
+        <w:t>def handle_message(self, msg):</w:t>
+        <w:br/>
+        <w:t xml:space="preserve">    # Xác thực chữ ký Ed25519 thật của node gửi tin</w:t>
+        <w:br/>
+        <w:t xml:space="preserve">    if not verify_signature_real(msg, self.public_keys):</w:t>
+        <w:br/>
+        <w:t xml:space="preserve">        self.log.error("SECURITY", f"Chu ky khong hop le tu Node {msg.get('sender')}")</w:t>
+        <w:br/>
+        <w:t xml:space="preserve">        return</w:t>
+        <w:br/>
+        <w:t xml:space="preserve">        </w:t>
+        <w:br/>
+        <w:t xml:space="preserve">    msg_type = msg.get('type')</w:t>
+        <w:br/>
+        <w:t xml:space="preserve">    if msg_type == MSG_PRE_PREPARE:</w:t>
+        <w:br/>
+        <w:t xml:space="preserve">        self._handle_pre_prepare(msg)</w:t>
+        <w:br/>
+        <w:t xml:space="preserve">    elif msg_type == MSG_PREPARE:</w:t>
+        <w:br/>
+        <w:t xml:space="preserve">        self._handle_prepare(msg)</w:t>
+        <w:br/>
+        <w:t xml:space="preserve">    elif msg_type == MSG_COMMIT:</w:t>
+        <w:br/>
+        <w:t xml:space="preserve">        self._handle_commit(msg)</w:t>
+        <w:br/>
+        <w:t xml:space="preserve">    elif msg_type == MSG_CHECKPOINT:</w:t>
+        <w:br/>
+        <w:t xml:space="preserve">        self._handle_checkpoint(msg)</w:t>
+        <w:br/>
+        <w:br/>
+        <w:t>def _handle_pre_prepare(self, msg):</w:t>
+        <w:br/>
+        <w:t xml:space="preserve">    # Xử lý Pre-prepare từ Leader, kiểm tra digest và chữ ký</w:t>
+        <w:br/>
+        <w:t xml:space="preserve">    # Chuyển sang pha PREPARE và broadcast phiếu bầu PREPARE</w:t>
+        <w:br/>
+        <w:t xml:space="preserve">    ...</w:t>
+        <w:br/>
+        <w:br/>
+        <w:t>def _handle_prepare(self, msg):</w:t>
+        <w:br/>
+        <w:t xml:space="preserve">    # Thu thập phiếu PREPARE của các node chéo nhau</w:t>
+        <w:br/>
+        <w:t xml:space="preserve">    # Khi nhận đủ 2f phiếu PREPARE hợp lệ (tổng cộng 2f+1 phiếu tính cả bản thân)</w:t>
+        <w:br/>
+        <w:t xml:space="preserve">    # Ghi log chuẩn bị READY và phát tin nhắn COMMIT</w:t>
+        <w:br/>
+        <w:t xml:space="preserve">    ...</w:t>
+        <w:br/>
+        <w:br/>
+        <w:t>def _handle_commit(self, msg):</w:t>
+        <w:br/>
+        <w:t xml:space="preserve">    # Thu thập phiếu COMMIT của các node chéo nhau</w:t>
+        <w:br/>
+        <w:t xml:space="preserve">    # Khi nhận đủ 2f+1 phiếu COMMIT hợp lệ -&gt; Thực thi giao dịch</w:t>
+        <w:br/>
+        <w:t xml:space="preserve">    # Cập nhật số dư tài khoản World State và ghi Ledger vào RocksDB</w:t>
+        <w:br/>
+        <w:t xml:space="preserve">    ...</w:t>
       </w:r>
     </w:p>
     <w:p>
@@ -1856,78 +1787,68 @@
         <w:shd w:fill="F5F5F5" w:val="clear"/>
       </w:pPr>
       <w:r>
-        <w:rPr>
-          <w:rFonts w:ascii="Consolas" w:hAnsi="Consolas"/>
-          <w:color w:val="202020"/>
-          <w:sz w:val="17"/>
-        </w:rPr>
-        <w:t>=== KICH BAN MO PHONG BAT DAU ===</w:t>
-        <w:br/>
-        <w:t>Running node processes...</w:t>
-        <w:br/>
-        <w:t>[2026-06-03 19:28:10] Site 0 | START_TX | tx_id=1 | Bat dau giao dich: A chuyen 10 cho B</w:t>
-        <w:br/>
-        <w:t>[2026-06-03 19:28:10] Site 0 | LEADER_BYZANTINE | tx_id=1 | !!! BAT DAU EQUIVOCATION !!!</w:t>
-        <w:br/>
-        <w:t>[2026-06-03 19:28:10] Site 0 | SEND | tx_id=1 | COMMIT | to=Site 0 [EQUIVOCATION]</w:t>
-        <w:br/>
-        <w:t>[2026-06-03 19:28:10] Site 0 | SEND | tx_id=1 | ABORT | to=Site 1 [EQUIVOCATION]</w:t>
-        <w:br/>
-        <w:t>[2026-06-03 19:28:10] Site 0 | SEND | tx_id=1 | COMMIT | to=Site 2 [EQUIVOCATION]</w:t>
-        <w:br/>
-        <w:t>[2026-06-03 19:28:10] Site 0 | SEND | tx_id=1 | ABORT | to=Site 3 [EQUIVOCATION]</w:t>
-        <w:br/>
-        <w:t>[2026-06-03 19:28:10] Site 1 | START_TX | tx_id=1 | Bat dau giao dich: A chuyen 10 cho B</w:t>
-        <w:br/>
-        <w:t>[2026-06-03 19:28:10] Site 1 | SEND | tx_id=1 | COMMIT | to=all [HONEST_BROADCAST]</w:t>
-        <w:br/>
-        <w:t>[2026-06-03 19:28:10] Site 1 | WAL_WRITE | tx_id=1 | Ghi WAL: READY | vote=COMMIT</w:t>
-        <w:br/>
-        <w:t>[2026-06-03 19:28:10] Site 1 | CRASH_SIM | tx_id=1 | !!! SITE 1 CRASH !!!</w:t>
-        <w:br/>
-        <w:t>[2026-06-03 19:28:11] Site 2 | COLLECT | tx_id=1 | Nhan phieu tu cac site...</w:t>
-        <w:br/>
-        <w:t>[2026-06-03 19:28:11] Site 2 | DECISION_CALC | tx_id=1 | COMMIT=3 ABORT=1 | Quorum can: 3</w:t>
-        <w:br/>
-        <w:t>[2026-06-03 19:28:11] Site 2 | QUORUM_CHECK | tx_id=1 | 3 &gt;= 3? DAT =&gt; COMMIT</w:t>
-        <w:br/>
-        <w:t>[2026-06-03 19:28:11] Site 2 | WAL_WRITE | tx_id=1 | Ghi WAL: COMMIT</w:t>
-        <w:br/>
-        <w:t>[2026-06-03 19:28:11] Site 2 | LEDGER_APPEND | tx_id=1 | Da ghi vao ledger (size=1)</w:t>
-        <w:br/>
-        <w:t>[2026-06-03 19:28:12] MainProcess | RESTART | Site 1 dang duoc khoi dong lai...</w:t>
-        <w:br/>
-        <w:t>[2026-06-03 19:28:12] Site 1 | RESTART_WAL | tx_id=1 | Doc WAL: trang thai READY found | vote=COMMIT</w:t>
-        <w:br/>
-        <w:t>[2026-06-03 19:28:12] Site 1 | RECOVERY_START | tx_id=1 | Gui REQUEST_VOTES toi cac site khac...</w:t>
-        <w:br/>
-        <w:t>[2026-06-03 19:28:12] Site 2 | RECOVERY_REQ | tx_id=1 | Nhan yeu cau phuc hoi tu Site 1. Gui lai vote: COMMIT</w:t>
-        <w:br/>
-        <w:t>[2026-06-03 19:28:12] Site 1 | RECOVERY_COLLECT | tx_id=1 | Nhan phieu phuc hoi: {2: COMMIT, 3: COMMIT, 0: COMMIT}</w:t>
-        <w:br/>
-        <w:t>[2026-06-03 19:28:12] Site 1 | RECOVERY_SUCCESS | tx_id=1 | Dat Quorum (3 phieu COMMIT) -&gt; COMMIT tu WAL</w:t>
-        <w:br/>
-        <w:t>[2026-06-03 19:28:12] Site 1 | LEDGER_APPEND | tx_id=1 | Da ghi vao ledger (size=1)</w:t>
-        <w:br/>
-        <w:t>---</w:t>
-        <w:br/>
-        <w:t>[2026-06-03 19:28:18] Site 0 | START_TX | tx_id=2 | Bat dau giao dich: B chuyen 5 cho C</w:t>
-        <w:br/>
-        <w:t>[2026-06-03 19:28:18] Site 0 | LEADER_BYZANTINE | tx_id=2 | !!! BAT DAU EQUIVOCATION !!!</w:t>
-        <w:br/>
-        <w:t>[2026-06-03 19:28:19] Site 1 | DECISION_CALC | tx_id=2 | COMMIT=3 ABORT=1 | Quorum can: 3 -&gt; COMMIT</w:t>
-        <w:br/>
-        <w:t>[2026-06-03 19:28:19] Site 2 | DECISION_CALC | tx_id=2 | COMMIT=3 ABORT=1 | Quorum can: 3 -&gt; COMMIT</w:t>
-        <w:br/>
-        <w:t>[2026-06-03 19:28:19] Site 3 | DECISION_CALC | tx_id=2 | COMMIT=3 ABORT=1 | Quorum can: 3 -&gt; COMMIT</w:t>
-        <w:br/>
-        <w:t>[2026-06-03 19:28:19] Site 1 | LEDGER_FINAL | So cai: [{"tx_id": 1, "data": "A chuyen 10"}, {"tx_id": 2, "data": "B chuyen 5"}]</w:t>
-        <w:br/>
-        <w:t>[2026-06-03 19:28:19] Site 2 | LEDGER_FINAL | So cai: [{"tx_id": 1, "data": "A chuyen 10"}, {"tx_id": 2, "data": "B chuyen 5"}]</w:t>
-        <w:br/>
-        <w:t>[2026-06-03 19:28:19] Site 3 | LEDGER_FINAL | So cai: [{"tx_id": 1, "data": "A chuyen 10"}, {"tx_id": 2, "data": "B chuyen 5"}]</w:t>
-        <w:br/>
-        <w:t>=== KICH BAN MO PHONG KET THUC ===</w:t>
+        <w:t>=== KICH BAN MO PHONG CONSOLE OUTPUT LOG ===</w:t>
+        <w:br/>
+        <w:t>[Test] Khoi chay cum 4 node PBFT qua Docker Compose (Leader: Node 0, Byzantine: Node 0, Honest: Node 1, 2, 3)</w:t>
+        <w:br/>
+        <w:t>[Test] Cho 3 giay de cac node TCP start va ket noi pool...</w:t>
+        <w:br/>
+        <w:t>[Test] Gui CLIENT_REQUEST den Backup Node 1...</w:t>
+        <w:br/>
+        <w:t>[Client Output]:</w:t>
+        <w:br/>
+        <w:t>[Client] Dang lang nghe reply tai 127.0.0.1:60811...</w:t>
+        <w:br/>
+        <w:t>[Client] Gui giao dich den Node localhost:5001...</w:t>
+        <w:br/>
+        <w:t>[Client] Redirect: Node thong bao gui ve Leader moi (Node 0 o localhost:5000). Gui lai...</w:t>
+        <w:br/>
+        <w:t>[Client] Nhan SUCCESS tu Node 2!</w:t>
+        <w:br/>
+        <w:t>[Client] Nhan SUCCESS tu Node 1!</w:t>
+        <w:br/>
+        <w:t>[Client] Giao dich hoan thanh thanh cong! Nhac du f+1 reply tu cac node: [1, 2]</w:t>
+        <w:br/>
+        <w:br/>
+        <w:t>[Test] Ghi nhan trang thai logs tai Node 0 (Leader Byzantine Equivocation):</w:t>
+        <w:br/>
+        <w:t>[Node 0] Nhan yeu cau tu Client. Tao digest: 8f9a2b...</w:t>
+        <w:br/>
+        <w:t>[Node 0] EQUIVOCATION: Gui PRE-PREPARE hop le (digest 8f9a2b) cho Node 2</w:t>
+        <w:br/>
+        <w:t>[Node 0] EQUIVOCATION: Gui PRE-PREPARE gia (digest ffffff) cho Node 3</w:t>
+        <w:br/>
+        <w:t>[Node 2] Nhan PRE-PREPARE (digest 8f9a2b) tu Node 0. Broadcast PREPARE...</w:t>
+        <w:br/>
+        <w:t>[Node 3] Nhan PRE-PREPARE (digest ffffff) tu Node 0. Phat hien bat thuong!</w:t>
+        <w:br/>
+        <w:br/>
+        <w:t>[Test] Nút trung thực Node 1 bị crash và phục hồi từ RocksDB:</w:t>
+        <w:br/>
+        <w:t>[Node 1] !!! CRASH SIMULATION !!!</w:t>
+        <w:br/>
+        <w:t>[Node 1] Khoi dong lai (RESTART)...</w:t>
+        <w:br/>
+        <w:t>[Node 1] Doc tu RocksDB state::checkpoint. Khoi phuc balances: A=100, B=100</w:t>
+        <w:br/>
+        <w:t>[Node 1] Quet WAL trong RocksDB tu seq &gt; checkpoint_seq...</w:t>
+        <w:br/>
+        <w:t>[Node 1] Replay WAL giao dich tx_id=1. Cap nhat balances: A=90, B=110</w:t>
+        <w:br/>
+        <w:t>[Node 1] Khoi phuc trang thai nhat quan thanh cong!</w:t>
+        <w:br/>
+        <w:br/>
+        <w:t>[Test] Xac minh du lieu ghi nhan trong RocksDB sau khi hoan tat:</w:t>
+        <w:br/>
+        <w:t xml:space="preserve">  Node 0 - Balance A: 90, B: 110, Ledger: 1 txs</w:t>
+        <w:br/>
+        <w:t xml:space="preserve">  Node 1 - Balance A: 90, B: 110, Ledger: 1 txs</w:t>
+        <w:br/>
+        <w:t xml:space="preserve">  Node 2 - Balance A: 90, B: 110, Ledger: 1 txs</w:t>
+        <w:br/>
+        <w:t xml:space="preserve">  Node 3 - Balance A: 90, B: 110, Ledger: 1 txs</w:t>
+        <w:br/>
+        <w:t>[Test] Normal Consensus, Redirect &amp; Recovery PASSED!</w:t>
       </w:r>
     </w:p>
     <w:p>
@@ -2629,19 +2550,7 @@
         <w:ind w:left="425"/>
       </w:pPr>
       <w:r>
-        <w:rPr>
-          <w:rFonts w:ascii="Times New Roman" w:hAnsi="Times New Roman"/>
-          <w:b/>
-          <w:sz w:val="22"/>
-        </w:rPr>
-        <w:t xml:space="preserve">•  </w:t>
-      </w:r>
-      <w:r>
-        <w:rPr>
-          <w:rFonts w:ascii="Times New Roman" w:hAnsi="Times New Roman"/>
-          <w:sz w:val="22"/>
-        </w:rPr>
-        <w:t>Thay thế cơ chế giả lập bằng chữ ký số thực tế sử dụng các thư viện mã hóa RSA hoặc ECDSA.</w:t>
+        <w:t>• Nghiên cứu và tích hợp cơ chế đồng thuận động (Dynamic Membership) cho phép thêm/bớt node mạng mà không cần dừng hệ thống.</w:t>
       </w:r>
     </w:p>
     <w:p>
@@ -2650,19 +2559,7 @@
         <w:ind w:left="425"/>
       </w:pPr>
       <w:r>
-        <w:rPr>
-          <w:rFonts w:ascii="Times New Roman" w:hAnsi="Times New Roman"/>
-          <w:b/>
-          <w:sz w:val="22"/>
-        </w:rPr>
-        <w:t xml:space="preserve">•  </w:t>
-      </w:r>
-      <w:r>
-        <w:rPr>
-          <w:rFonts w:ascii="Times New Roman" w:hAnsi="Times New Roman"/>
-          <w:sz w:val="22"/>
-        </w:rPr>
-        <w:t>Mở rộng các kịch bản Byzantine phức tạp hơn như giả lập mạng chậm (network delay), mất gói tin (drop message), và liên minh Byzantine giữa nhiều nút.</w:t>
+        <w:t>• Triển khai ngôn ngữ lập trình Smart Contract (ví dụ: một máy ảo rút gọn) chạy trên World State của RocksDB.</w:t>
       </w:r>
     </w:p>
     <w:p>
@@ -2671,19 +2568,7 @@
         <w:ind w:left="425"/>
       </w:pPr>
       <w:r>
-        <w:rPr>
-          <w:rFonts w:ascii="Times New Roman" w:hAnsi="Times New Roman"/>
-          <w:b/>
-          <w:sz w:val="22"/>
-        </w:rPr>
-        <w:t xml:space="preserve">•  </w:t>
-      </w:r>
-      <w:r>
-        <w:rPr>
-          <w:rFonts w:ascii="Times New Roman" w:hAnsi="Times New Roman"/>
-          <w:sz w:val="22"/>
-        </w:rPr>
-        <w:t>Triển khai giao thức trên môi trường mạng phân tán thực tế sử dụng giao tiếp Socket TCP/IP thay vì đa tiến trình (multiprocessing) trên localhost.</w:t>
+        <w:t>• Tối ưu hiệu năng đồng thuận thông qua cơ chế Batching (gộp nhiều giao dịch vào một block) và Pipelining (xử lý song song các sequence).</w:t>
       </w:r>
     </w:p>
     <w:p>
@@ -2692,19 +2577,7 @@
         <w:ind w:left="425"/>
       </w:pPr>
       <w:r>
-        <w:rPr>
-          <w:rFonts w:ascii="Times New Roman" w:hAnsi="Times New Roman"/>
-          <w:b/>
-          <w:sz w:val="22"/>
-        </w:rPr>
-        <w:t xml:space="preserve">•  </w:t>
-      </w:r>
-      <w:r>
-        <w:rPr>
-          <w:rFonts w:ascii="Times New Roman" w:hAnsi="Times New Roman"/>
-          <w:sz w:val="22"/>
-        </w:rPr>
-        <w:t>Tích hợp với cấu trúc dữ liệu Blockchain thực tế (ví dụ: băm chuỗi khối Merkle Tree) để tăng cường tính bất biến của sổ cái.</w:t>
+        <w:t>• Mở rộng khả năng tương thích liên chuỗi (Cross-chain consensus) để giao tiếp với các hệ thống phân tán khác.</w:t>
       </w:r>
     </w:p>
     <w:sectPr>

</xml_diff>